<commit_message>
Road capture rig options note (Murray River)
Co-Authored-By: Claude Opus 5.5 <noreply@anthropic.com>
Claude-Session: https://claude.ai/code/session_01RKGFyarCMuMinKYL7AiBap
</commit_message>
<xml_diff>
--- a/FP/VP527277/Final/JCE_FP_VP527277_Final_RevH.docx
+++ b/FP/VP527277/Final/JCE_FP_VP527277_Final_RevH.docx
@@ -3665,7 +3665,7 @@
                 <w:i w:val="0"/>
                 <w:sz w:val="18"/>
               </w:rPr>
-              <w:t>Data review in Stage 1 and the pilot in Stage 2 settle Asset IDs, segments and codes before full capture; JCE builds the register itself, so partner data is checked as it arrives</w:t>
+              <w:t>Data review in Stage 1 and the pilot in Stage 2 settle Asset IDs, segments and codes before full capture; JCE builds the register itself, so data is checked as it arrives</w:t>
             </w:r>
           </w:p>
         </w:tc>
@@ -5238,7 +5238,7 @@
                 <w:i w:val="0"/>
                 <w:sz w:val="18"/>
               </w:rPr>
-              <w:t>19/04/2027 to 30/04/2027</w:t>
+              <w:t>12/04/2027 to 30/04/2027</w:t>
             </w:r>
           </w:p>
         </w:tc>
@@ -5660,7 +5660,7 @@
       <w:r>
         <w:drawing>
           <wp:inline xmlns:a="http://schemas.openxmlformats.org/drawingml/2006/main" xmlns:pic="http://schemas.openxmlformats.org/drawingml/2006/picture">
-            <wp:extent cx="5580000" cy="3459600"/>
+            <wp:extent cx="5580000" cy="3906000"/>
             <wp:docPr id="1" name="Picture 1"/>
             <wp:cNvGraphicFramePr>
               <a:graphicFrameLocks noChangeAspect="1"/>
@@ -5669,7 +5669,7 @@
               <a:graphicData uri="http://schemas.openxmlformats.org/drawingml/2006/picture">
                 <pic:pic>
                   <pic:nvPicPr>
-                    <pic:cNvPr id="0" name="VP527277_Gantt_Year1_RevG.png"/>
+                    <pic:cNvPr id="0" name="VP527277_Gantt_Year1_RevH.png"/>
                     <pic:cNvPicPr/>
                   </pic:nvPicPr>
                   <pic:blipFill>
@@ -5681,7 +5681,7 @@
                   <pic:spPr>
                     <a:xfrm>
                       <a:off x="0" y="0"/>
-                      <a:ext cx="5580000" cy="3459600"/>
+                      <a:ext cx="5580000" cy="3906000"/>
                     </a:xfrm>
                     <a:prstGeom prst="rect"/>
                   </pic:spPr>
@@ -5863,7 +5863,7 @@
                 <w:i w:val="0"/>
                 <w:sz w:val="18"/>
               </w:rPr>
-              <w:t>Single point of contact; methodology, drone capture, GIS and register, QA, remaining life, defect and safety assessment, programs, valuation inputs and reports</w:t>
+              <w:t>Single point of contact; methodology, vehicle capture supervision, drone capture, GIS and register, QA, remaining life, defect and safety assessment, programs, valuation inputs and reports</w:t>
             </w:r>
           </w:p>
         </w:tc>
@@ -7160,7 +7160,7 @@
           <w:b w:val="0"/>
           <w:i w:val="0"/>
         </w:rPr>
-        <w:t>JCE is based outside the Murray River Council area and has no staff or depot in the region. Its economic contribution under this contract is local spend during field work: accommodation, meals and fuel in Moama, Barham, Mathoura and Moulamein for JCE's drone campaigns (about 64 room-nights in Year 1, covering vehicle capture and drone campaigns) and for the bridge partner's crews during the February to April 2027 field program, and the same each year from 2028 to 2031 in the zone being inspected. [TBC - Jayden: add any partner staff, office or suppliers in the region or in Echuca, and a local casual field assistant if one is engaged.]</w:t>
+        <w:t>JCE is based outside the Murray River Council area and has no staff or depot in the region. Its economic contribution under this contract is local spend during field work: accommodation, meals and fuel in Moama, Barham, Mathoura and Moulamein for JCE's field work (about 64 room-nights in Year 1, vehicle capture and drone campaigns) and for the bridge partner's crews during the February to April 2027 field program, and the same each year from 2028 to 2031 in the zone being inspected. [TBC - Jayden: add any partner staff, office or suppliers in the region or in Echuca, and a local casual field assistant if one is engaged.]</w:t>
       </w:r>
     </w:p>
     <w:p>

</xml_diff>

<commit_message>
REVIEW rebuilt with Shaw Road; handover for ChatGPT
Co-Authored-By: Claude Opus 5.5 <noreply@anthropic.com>
Claude-Session: https://claude.ai/code/session_01RKGFyarCMuMinKYL7AiBap
</commit_message>
<xml_diff>
--- a/FP/VP527277/Final/JCE_FP_VP527277_Final_RevH.docx
+++ b/FP/VP527277/Final/JCE_FP_VP527277_Final_RevH.docx
@@ -112,7 +112,7 @@
                 <w:i w:val="0"/>
                 <w:sz w:val="18"/>
               </w:rPr>
-              <w:t>Proposal No</w:t>
+              <w:t>Our ref (FP No)</w:t>
             </w:r>
           </w:p>
         </w:tc>
@@ -128,7 +128,7 @@
                 <w:i w:val="0"/>
                 <w:sz w:val="18"/>
               </w:rPr>
-              <w:t>JCE-FP-VP527277</w:t>
+              <w:t>FP-022 (VP527277)</w:t>
             </w:r>
           </w:p>
         </w:tc>
@@ -445,7 +445,7 @@
                 <w:i w:val="0"/>
                 <w:sz w:val="18"/>
               </w:rPr>
-              <w:t>$ 1,270,973.00</w:t>
+              <w:t>$ 1,390,147.00</w:t>
             </w:r>
           </w:p>
         </w:tc>
@@ -511,6 +511,15 @@
     <w:p>
       <w:r>
         <w:rPr>
+          <w:b w:val="0"/>
+          <w:i w:val="0"/>
+        </w:rPr>
+        <w:t>Our ref: FP-022</w:t>
+      </w:r>
+    </w:p>
+    <w:p>
+      <w:r>
+        <w:rPr>
           <w:b/>
           <w:i w:val="0"/>
         </w:rPr>
@@ -550,7 +559,7 @@
           <w:b w:val="0"/>
           <w:i w:val="0"/>
         </w:rPr>
-        <w:t>The lump sum is $ 1,270,973.00 including GST for all five valuation years, with Level 3/4 bridge inspections priced separately as Council's option. Our offer stays open for 60 days after the closing time.</w:t>
+        <w:t>The lump sum is $ 1,390,147.00 including GST for all five valuation years, with Level 3/4 bridge inspections priced separately as Council's option. Our offer stays open for 60 days after the closing time.</w:t>
       </w:r>
     </w:p>
     <w:p>
@@ -2606,7 +2615,7 @@
           <w:b w:val="0"/>
           <w:i w:val="0"/>
         </w:rPr>
-        <w:t>Roads, kerb and roadside (JCE): vehicle-mounted geo-referenced high-resolution stills every 10 m, GPS embedded natively in each image (DRFA compliant), wide enough to capture kerb to kerb or table drain to table drain and roadside hazards on both sides, with offset GPS pick-up of on-road and roadside features. One rig captures the network in three blocks (08/02 to 12/02, 01/03 to 05/03 and 22/03 to 08/04/2027), about 22 capture days at 150 to 200 km a day inside the February to April window.</w:t>
+        <w:t>Roads, kerb and roadside (JCE): vehicle-mounted geo-referenced high-resolution stills every 10 m, GPS embedded natively in each image (DRFA compliant), wide enough to capture kerb to kerb or table drain to table drain and roadside hazards on both sides, with offset GPS pick-up of on-road and roadside features. One rig captures the network in three blocks (08/02 to 12/02, 01/03 to 05/03 and 22/03 to 16/04/2027), about 27 capture days at 100 to 200 km a day inside the February to April window.</w:t>
       </w:r>
     </w:p>
     <w:p>
@@ -2713,7 +2722,7 @@
           <w:b w:val="0"/>
           <w:i w:val="0"/>
         </w:rPr>
-        <w:t>JCE will deploy a vehicle-mounted 360 or multi-camera system with integrated GNSS and IMU and RTK correction (Mosaic-class or equivalent), recording geotagged stills at 10 m intervals with GPS embedded in each image.</w:t>
+        <w:t>JCE will deploy a Mosaic 51 or Mosaic X-class 360 camera with an Emlid RS3 RTK GNSS receiver on a roof-rack mount with a steel tether, triggering stills at 10 m intervals and writing the GPS position and time natively into each image at capture (DRFA compliant). A budget 360 camera with an RTK logger is carried as a backup.</w:t>
       </w:r>
     </w:p>
     <w:p>
@@ -2733,7 +2742,7 @@
           <w:b w:val="0"/>
           <w:i w:val="0"/>
         </w:rPr>
-        <w:t>One rig is enough: about 3,000 km at 150 to 200 km a day is 18 to 22 capture days inside about 60 working days. A casual driver and field assistant drives the capture vehicle; the rig runs automatically. Jayden rides along on the first capture days, checks each day's upload remotely and sets the route plan. Lone and remote work check-ins apply on rural roads.</w:t>
+        <w:t>One rig is enough: about 3,000 km at 100 to 200 km a day, with dead running and re-runs, is 26 to 36 field days including the pilot, against about 44 to 49 usable days between 08/02 and 30/04/2027 after allowing for wet weather and heat. A casual driver and field assistant drives the capture vehicle; the rig runs automatically. Jayden rides along on the first capture days, checks each day's upload remotely and sets the route plan. Lone and remote work check-ins apply on rural roads.</w:t>
       </w:r>
     </w:p>
     <w:p>
@@ -5173,7 +5182,7 @@
                 <w:i w:val="0"/>
                 <w:sz w:val="18"/>
               </w:rPr>
-              <w:t>JCE vehicle capture, all four zones (one rig, about 22 days)</w:t>
+              <w:t>JCE vehicle capture, all four zones (one rig, about 27 days)</w:t>
             </w:r>
           </w:p>
         </w:tc>
@@ -5193,7 +5202,7 @@
                 <w:i w:val="0"/>
                 <w:sz w:val="18"/>
               </w:rPr>
-              <w:t>08/02 to 12/02, 01/03 to 05/03 and 22/03 to 08/04/2027</w:t>
+              <w:t>08/02 to 12/02, 01/03 to 05/03 and 22/03 to 16/04/2027</w:t>
             </w:r>
           </w:p>
         </w:tc>
@@ -5238,7 +5247,7 @@
                 <w:i w:val="0"/>
                 <w:sz w:val="18"/>
               </w:rPr>
-              <w:t>12/04/2027 to 30/04/2027</w:t>
+              <w:t>19/04/2027 to 30/04/2027</w:t>
             </w:r>
           </w:p>
         </w:tc>
@@ -5993,7 +6002,7 @@
                 <w:i w:val="0"/>
                 <w:sz w:val="18"/>
               </w:rPr>
-              <w:t>Drives the capture vehicle (about 22 capture days and the pilot), drone visual observer on road sites, data offload and site safety</w:t>
+              <w:t>Drives the capture vehicle (about 27 capture days and the pilot), drone visual observer on road sites, data offload and site safety</w:t>
             </w:r>
           </w:p>
         </w:tc>
@@ -6217,7 +6226,7 @@
           <w:b w:val="0"/>
           <w:i w:val="0"/>
         </w:rPr>
-        <w:t>JCE is a principal-led practice. Jayden Callen delivers JCE's own work: about 923 hours between December 2026 and June 2027, an average of about 36.4 hours a week over about 25 working weeks. Two casual staff carry the volume work under his direction: a driver and field assistant for about 22 capture days, the pilot and the drone days, and a GIS and rating technician for first-pass ratings of about 300,000 images, GIS layers, the register and report tables (about 720 hours). The bridge partner inspects the structures and the valuer runs the valuation calculations.</w:t>
+        <w:t>JCE is a principal-led practice. Jayden Callen delivers JCE's own work: about 925 hours between December 2026 and June 2027, an average of about 36.4 hours a week over about 25 working weeks. Two casual staff carry the volume work under his direction: a driver and field assistant for about 27 capture days, the pilot and the drone days, and a GIS and rating technician for first-pass ratings of about 300,000 images, GIS layers, the register and report tables (about 720 hours). The bridge partner inspects the structures and the valuer runs the valuation calculations.</w:t>
       </w:r>
     </w:p>
     <w:tbl>
@@ -6495,7 +6504,7 @@
                 <w:i w:val="0"/>
                 <w:sz w:val="18"/>
               </w:rPr>
-              <w:t>149</w:t>
+              <w:t>150</w:t>
             </w:r>
           </w:p>
         </w:tc>
@@ -6561,7 +6570,7 @@
                 <w:i w:val="0"/>
                 <w:sz w:val="18"/>
               </w:rPr>
-              <w:t>160</w:t>
+              <w:t>161</w:t>
             </w:r>
           </w:p>
         </w:tc>
@@ -6824,7 +6833,7 @@
                 <w:i w:val="0"/>
                 <w:sz w:val="18"/>
               </w:rPr>
-              <w:t>923</w:t>
+              <w:t>925</w:t>
             </w:r>
           </w:p>
         </w:tc>
@@ -6841,7 +6850,7 @@
           <w:b w:val="0"/>
           <w:i w:val="0"/>
         </w:rPr>
-        <w:t>Weekly average by month: December 37, January 37.3, February 37.3, March 36.4, April 36.5, May 36.4 and June 34 hours. December to April run above 36 hours; the technician takes the completeness checks and report tables, and Jayden takes on no other major commission from December to May.</w:t>
+        <w:t>Weekly average by month: December 37, January 37.3, February 37.5, March 36.6, April 36.5, May 36.4 and June 34 hours. December to April run above 36 hours; the technician takes the completeness checks and report tables, and Jayden takes on no other major commission from December to May.</w:t>
       </w:r>
     </w:p>
     <w:p>
@@ -7505,7 +7514,7 @@
                 <w:i w:val="0"/>
                 <w:sz w:val="18"/>
               </w:rPr>
-              <w:t>$ 499,300.00</w:t>
+              <w:t>$ 590,310.00</w:t>
             </w:r>
           </w:p>
         </w:tc>
@@ -7571,7 +7580,7 @@
                 <w:i w:val="0"/>
                 <w:sz w:val="18"/>
               </w:rPr>
-              <w:t>$ 152,180.00</w:t>
+              <w:t>$ 156,670.00</w:t>
             </w:r>
           </w:p>
         </w:tc>
@@ -7637,7 +7646,7 @@
                 <w:i w:val="0"/>
                 <w:sz w:val="18"/>
               </w:rPr>
-              <w:t>$ 160,420.00</w:t>
+              <w:t>$ 165,360.00</w:t>
             </w:r>
           </w:p>
         </w:tc>
@@ -7703,7 +7712,7 @@
                 <w:i w:val="0"/>
                 <w:sz w:val="18"/>
               </w:rPr>
-              <w:t>$ 138,200.00</w:t>
+              <w:t>$ 140,990.00</w:t>
             </w:r>
           </w:p>
         </w:tc>
@@ -7769,7 +7778,7 @@
                 <w:i w:val="0"/>
                 <w:sz w:val="18"/>
               </w:rPr>
-              <w:t>$ 205,330.00</w:t>
+              <w:t>$ 210,440.00</w:t>
             </w:r>
           </w:p>
         </w:tc>
@@ -7837,7 +7846,7 @@
                 <w:i w:val="0"/>
                 <w:sz w:val="18"/>
               </w:rPr>
-              <w:t>$ 1,155,430.00</w:t>
+              <w:t>$ 1,263,770.00</w:t>
             </w:r>
           </w:p>
         </w:tc>
@@ -7905,7 +7914,7 @@
                 <w:i w:val="0"/>
                 <w:sz w:val="18"/>
               </w:rPr>
-              <w:t>$ 115,543.00</w:t>
+              <w:t>$ 126,377.00</w:t>
             </w:r>
           </w:p>
         </w:tc>
@@ -7970,7 +7979,7 @@
                 <w:i w:val="0"/>
                 <w:sz w:val="18"/>
               </w:rPr>
-              <w:t>$ 1,270,973.00</w:t>
+              <w:t>$ 1,390,147.00</w:t>
             </w:r>
           </w:p>
         </w:tc>
@@ -8256,7 +8265,7 @@
                 <w:i w:val="0"/>
                 <w:sz w:val="18"/>
               </w:rPr>
-              <w:t>$ 47,930.00</w:t>
+              <w:t>$ 48,290.00</w:t>
             </w:r>
           </w:p>
         </w:tc>
@@ -8565,7 +8574,7 @@
                 <w:i w:val="0"/>
                 <w:sz w:val="18"/>
               </w:rPr>
-              <w:t>Casual driver and field assistant: about 22 capture days, 3-day pilot, drone visual observer days, data offload and travel (fixed allowance) [TBC - Jayden]</w:t>
+              <w:t>Casual driver and field assistant: about 30 capture days including the pilot, contingency days, drone visual observer days, data offload and travel (fixed allowance, paid at or above award)</w:t>
             </w:r>
           </w:p>
         </w:tc>
@@ -8586,7 +8595,7 @@
                 <w:i w:val="0"/>
                 <w:sz w:val="18"/>
               </w:rPr>
-              <w:t>$ 10,000.00</w:t>
+              <w:t>$ 18,000.00</w:t>
             </w:r>
           </w:p>
         </w:tc>
@@ -8631,7 +8640,7 @@
                 <w:i w:val="0"/>
                 <w:sz w:val="18"/>
               </w:rPr>
-              <w:t>Casual GIS and desktop rating technician: first-pass rating of about 300,000 road and roadside images and drone imagery, road defect coding, image processing, GIS layers, register population, image index, maps and report tables (718 h at $110/h charge rate; cost about $65/h)</w:t>
+              <w:t>Casual GIS and desktop rating technician: first-pass rating of about 300,000 road and roadside images and drone imagery, road defect coding, image processing, GIS layers, register population, image index, maps and report tables (718 h at the JCE CAD / GIS Technician rate of $160/h)</w:t>
             </w:r>
           </w:p>
         </w:tc>
@@ -8652,7 +8661,7 @@
                 <w:i w:val="0"/>
                 <w:sz w:val="18"/>
               </w:rPr>
-              <w:t>$ 78,980.00</w:t>
+              <w:t>$ 114,880.00</w:t>
             </w:r>
           </w:p>
         </w:tc>
@@ -8763,7 +8772,7 @@
                 <w:i w:val="0"/>
                 <w:sz w:val="18"/>
               </w:rPr>
-              <w:t>Vehicle capture rig equipment rate (one 360/multi-camera system with GNSS/IMU and RTK, mounts, storage; covers lease or amortised purchase): 25 capture and pilot days at $350 per day [TBC - Jayden to confirm rate]</w:t>
+              <w:t>Vehicle capture day rate (Mosaic 51/X-class 360 rig with Emlid RS3 RTK GNSS, vehicle fit-out, data storage and image processing): 30 capture and pilot days at $1,850 per day</w:t>
             </w:r>
           </w:p>
         </w:tc>
@@ -8784,7 +8793,7 @@
                 <w:i w:val="0"/>
                 <w:sz w:val="18"/>
               </w:rPr>
-              <w:t>$ 8,750.00</w:t>
+              <w:t>$ 55,500.00</w:t>
             </w:r>
           </w:p>
         </w:tc>
@@ -8895,7 +8904,7 @@
                 <w:i w:val="0"/>
                 <w:sz w:val="18"/>
               </w:rPr>
-              <w:t>Rig backup: spare 360 camera and GNSS receiver, or short-term hire of a second rig if the first fails</w:t>
+              <w:t>Rig backup: budget 360 camera with RTK logger carried as a spare, or short-term hire of a second rig if capture falls more than a week behind</w:t>
             </w:r>
           </w:p>
         </w:tc>
@@ -9245,7 +9254,7 @@
                 <w:i w:val="0"/>
                 <w:sz w:val="18"/>
               </w:rPr>
-              <w:t>$ 499,300.00</w:t>
+              <w:t>$ 590,310.00</w:t>
             </w:r>
           </w:p>
         </w:tc>
@@ -9399,7 +9408,7 @@
                 <w:i w:val="0"/>
                 <w:sz w:val="18"/>
               </w:rPr>
-              <w:t>$ 131,030.60</w:t>
+              <w:t>$ 154,914.21</w:t>
             </w:r>
           </w:p>
         </w:tc>
@@ -9465,7 +9474,7 @@
                 <w:i w:val="0"/>
                 <w:sz w:val="18"/>
               </w:rPr>
-              <w:t>$ 136,342.64</w:t>
+              <w:t>$ 161,194.52</w:t>
             </w:r>
           </w:p>
         </w:tc>
@@ -9531,7 +9540,7 @@
                 <w:i w:val="0"/>
                 <w:sz w:val="18"/>
               </w:rPr>
-              <w:t>$ 6,925.34</w:t>
+              <w:t>$ 8,187.66</w:t>
             </w:r>
           </w:p>
         </w:tc>
@@ -9597,7 +9606,7 @@
                 <w:i w:val="0"/>
                 <w:sz w:val="18"/>
               </w:rPr>
-              <w:t>$ 17,457.63</w:t>
+              <w:t>$ 20,639.72</w:t>
             </w:r>
           </w:p>
         </w:tc>
@@ -9663,7 +9672,7 @@
                 <w:i w:val="0"/>
                 <w:sz w:val="18"/>
               </w:rPr>
-              <w:t>$ 4,898.89</w:t>
+              <w:t>$ 5,791.84</w:t>
             </w:r>
           </w:p>
         </w:tc>
@@ -9729,7 +9738,7 @@
                 <w:i w:val="0"/>
                 <w:sz w:val="18"/>
               </w:rPr>
-              <w:t>$ 9,915.83</w:t>
+              <w:t>$ 11,723.24</w:t>
             </w:r>
           </w:p>
         </w:tc>
@@ -9795,7 +9804,7 @@
                 <w:i w:val="0"/>
                 <w:sz w:val="18"/>
               </w:rPr>
-              <w:t>$ 36,712.17</w:t>
+              <w:t>$ 43,403.89</w:t>
             </w:r>
           </w:p>
         </w:tc>
@@ -9861,7 +9870,7 @@
                 <w:i w:val="0"/>
                 <w:sz w:val="18"/>
               </w:rPr>
-              <w:t>$ 16,395.22</w:t>
+              <w:t>$ 19,383.66</w:t>
             </w:r>
           </w:p>
         </w:tc>
@@ -9927,7 +9936,7 @@
                 <w:i w:val="0"/>
                 <w:sz w:val="18"/>
               </w:rPr>
-              <w:t>$ 1,377.20</w:t>
+              <w:t>$ 1,628.23</w:t>
             </w:r>
           </w:p>
         </w:tc>
@@ -9993,7 +10002,7 @@
                 <w:i w:val="0"/>
                 <w:sz w:val="18"/>
               </w:rPr>
-              <w:t>$ 129,063.16</w:t>
+              <w:t>$ 152,588.18</w:t>
             </w:r>
           </w:p>
         </w:tc>
@@ -10059,7 +10068,7 @@
                 <w:i w:val="0"/>
                 <w:sz w:val="18"/>
               </w:rPr>
-              <w:t>$ 9,181.32</w:t>
+              <w:t>$ 10,854.85</w:t>
             </w:r>
           </w:p>
         </w:tc>
@@ -10124,7 +10133,7 @@
                 <w:i w:val="0"/>
                 <w:sz w:val="18"/>
               </w:rPr>
-              <w:t>$ 499,300.00</w:t>
+              <w:t>$ 590,310.00</w:t>
             </w:r>
           </w:p>
         </w:tc>
@@ -11722,7 +11731,7 @@
           <w:b w:val="0"/>
           <w:i w:val="0"/>
         </w:rPr>
-        <w:t>Additional JCE resources for directed work: vehicle capture rig $350 per capture day plus a driver at cost plus 10%; GIS and rating technician $110 per hour. Partner rates for directed additional work, including JCE's 10% mark-up: bridge inspector per hour and valuer per hour [TBC - Jayden: from partner quotes, parts B and C]. A day comprises eight (8) hours. Disbursements other than vehicle travel are charged at cost.</w:t>
+        <w:t>Additional JCE resources for directed work: vehicle capture day rate $1,850 per capture day plus a driver at cost plus 10%; GIS and rating technician at the CAD / GIS Technician rate. Partner rates for directed additional work, including JCE's 10% mark-up: bridge inspector per hour and valuer per hour [TBC - Jayden: from partner quotes, parts B and C]. A day comprises eight (8) hours. Disbursements other than vehicle travel are charged at cost.</w:t>
       </w:r>
     </w:p>
     <w:p>
@@ -11802,7 +11811,7 @@
         <w:color w:val="555555"/>
         <w:sz w:val="16"/>
       </w:rPr>
-      <w:t xml:space="preserve">JCE Infrastructure Pty Ltd  ·  JCE-FP-VP527277 Rev H  ·  Murray River Council MRC-2645  ·  Page </w:t>
+      <w:t xml:space="preserve">JCE Infrastructure Pty Ltd  ·  FP-022 Rev H (VP527277)  ·  Murray River Council MRC-2645  ·  Page </w:t>
     </w:r>
     <w:r>
       <w:rPr>

</xml_diff>